<commit_message>
Clinical-trial cursor extend + loading timer on more trials
promote local -> dev (2026-09-22T16:53:17.631627+00:00)
</commit_message>
<xml_diff>
--- a/architecture/TargetArchitecture/3_DevOpsGovernanceFramework.docx
+++ b/architecture/TargetArchitecture/3_DevOpsGovernanceFramework.docx
@@ -4686,18 +4686,16 @@
           <w:noProof/>
         </w:rPr>
         <w:drawing>
-          <wp:inline distT="0" distB="0" distL="0" distR="0" wp14:anchorId="03568A31" wp14:editId="31C74A17">
-            <wp:extent cx="5943600" cy="11962891"/>
-            <wp:effectExtent l="0" t="0" r="0" b="635"/>
-            <wp:docPr id="1434603652" name="Picture 1"/>
-            <wp:cNvGraphicFramePr>
-              <a:graphicFrameLocks xmlns:a="http://schemas.openxmlformats.org/drawingml/2006/main" noChangeAspect="1"/>
-            </wp:cNvGraphicFramePr>
+          <wp:inline distT="0" distB="0" distL="0" distR="0" wp14:anchorId="0C904361" wp14:editId="697C3DDC">
+            <wp:extent cx="5486400" cy="2755265"/>
+            <wp:effectExtent l="0" t="0" r="0" b="6985"/>
+            <wp:docPr id="706751355" name="Picture 1"/>
+            <wp:cNvGraphicFramePr/>
             <a:graphic xmlns:a="http://schemas.openxmlformats.org/drawingml/2006/main">
               <a:graphicData uri="http://schemas.openxmlformats.org/drawingml/2006/picture">
                 <pic:pic xmlns:pic="http://schemas.openxmlformats.org/drawingml/2006/picture">
                   <pic:nvPicPr>
-                    <pic:cNvPr id="1434603652" name=""/>
+                    <pic:cNvPr id="706751355" name=""/>
                     <pic:cNvPicPr/>
                   </pic:nvPicPr>
                   <pic:blipFill>
@@ -4709,7 +4707,7 @@
                   <pic:spPr>
                     <a:xfrm>
                       <a:off x="0" y="0"/>
-                      <a:ext cx="5943600" cy="11962891"/>
+                      <a:ext cx="5486400" cy="2755265"/>
                     </a:xfrm>
                     <a:prstGeom prst="rect">
                       <a:avLst/>
@@ -4726,8 +4724,46 @@
       <w:pPr>
         <w:pStyle w:val="Heading3"/>
       </w:pPr>
-      <w:r>
-        <w:t>Figure. Live enforcement hierarchy from hook surface through rule to worker (14 enforcements).</w:t>
+    </w:p>
+    <w:p>
+      <w:pPr>
+        <w:pStyle w:val="Heading3"/>
+      </w:pPr>
+    </w:p>
+    <w:p>
+      <w:pPr>
+        <w:pStyle w:val="Heading3"/>
+      </w:pPr>
+    </w:p>
+    <w:p>
+      <w:pPr>
+        <w:pStyle w:val="Heading3"/>
+      </w:pPr>
+      <w:r>
+        <w:t>Figure. Live enforcement hierarchy as nested UML packages; leaf members are «enforcement» classes.</w:t>
+      </w:r>
+    </w:p>
+    <w:p>
+      <w:pPr>
+        <w:pStyle w:val="Heading3"/>
+      </w:pPr>
+    </w:p>
+    <w:p>
+      <w:pPr>
+        <w:pStyle w:val="Heading3"/>
+      </w:pPr>
+    </w:p>
+    <w:p>
+      <w:pPr>
+        <w:pStyle w:val="Heading3"/>
+      </w:pPr>
+    </w:p>
+    <w:p>
+      <w:pPr>
+        <w:pStyle w:val="Heading3"/>
+      </w:pPr>
+      <w:r>
+        <w:t>Figure. Live enforcement hierarchy from hook surface through rule to capability (21 leaves; ENF-006 is five checks).</w:t>
       </w:r>
     </w:p>
     <w:p>

</xml_diff>

<commit_message>
Working-tree checkpoint: build/deploy chain, governance workers, pipeline specialty catalog, tests, diagram sources, brain content
Co-Authored-By: Claude Opus 4.8 <noreply@anthropic.com>
</commit_message>
<xml_diff>
--- a/architecture/TargetArchitecture/3_DevOpsGovernanceFramework.docx
+++ b/architecture/TargetArchitecture/3_DevOpsGovernanceFramework.docx
@@ -4777,6 +4777,78 @@
       </w:pPr>
       <w:r>
         <w:t xml:space="preserve"> — hook to rule to every wired enforcement — [I]</w:t>
+      </w:r>
+    </w:p>
+    <w:p>
+      <w:pPr>
+        <w:pStyle w:val="Heading3"/>
+      </w:pPr>
+      <w:r>
+        <w:t>2.5.2b The object model — manager, workers, scopes, parallel dispatch — [I]</w:t>
+      </w:r>
+    </w:p>
+    <w:p>
+      <w:pPr/>
+      <w:r>
+        <w:t>The live object model is not a hierarchy of Rule classes. engineering_rules.json is the registry: each rule is a record that owns one or more enforcement entries. ChatHealthyEnforcementManager is the dispatcher for Anthropic and git hooks. It loads that registry read-only, filters entries by the firing hook, and — when two or more match — runs them concurrently through a ThreadPoolExecutor that spawns one operating-system subprocess per enforcement. The gate therefore costs the slowest worker, not the sum. An entry that declares requires_lock = True is serialized by the manager around that spawn; read-only workers run unguarded. CommitGovernanceDriver is the second dispatcher for Rule-065's pre-commit subordinates: it settles the file set once, hands the same array to every worker on stdin, and joins them the same parallel way.</w:t>
+      </w:r>
+    </w:p>
+    <w:p>
+      <w:pPr/>
+      <w:r>
+        <w:t>EnforcementWorker is the abstract superclass. Concrete workers (ScanFilesEnforcementWorker, the deliberate-raise, Mongo, logging, separation, entrypoint, and migration scanners, plus CommitAuthorizationWorker and IdentityApprovalWorker) inherit it and implement run(). The base owns the contract that must be identical for every check: load own entry by enforcement_id, evaluate is_in_scope(), emit ViolationRecord lines on stdout, and return the worker exit codes the manager aggregates by fixed precedence. There is no separate ExceptionManager class. Excusing a file or a pattern is done with scopes rows on the enforcement entry — allowed_exact, allowed_pattern, excluded_exact, excluded_pattern — walked only in the base in that exclude-before-allow, exact-before-pattern order, then a per-check SCOPE_DEFAULT. Promote and deploy authorization workers are separate classes invoked by the chain; they are not EnforcementWorker subclasses and are not dispatched by the hook manager.</w:t>
+      </w:r>
+    </w:p>
+    <w:p>
+      <w:pPr/>
+      <w:r>
+        <w:t>Design V32 already publishes Figure 3.4a (manager, base worker, ViolationRecord, and chathealthy_lib) and Figure 3.2 (the parallel spawn sequence). The figure below is the governance view of that same code: it adds the concrete worker subclasses, CommitGovernanceDriver, RefusalReport, and the scopes exclusion contract so the OO shape of how rules actually run is visible next to the live capability inventory in §2.5.2a.</w:t>
+      </w:r>
+    </w:p>
+    <w:p>
+      <w:r>
+        <w:drawing>
+          <wp:inline xmlns:a="http://schemas.openxmlformats.org/drawingml/2006/main" xmlns:pic="http://schemas.openxmlformats.org/drawingml/2006/picture">
+            <wp:extent cx="5943600" cy="5058157"/>
+            <wp:docPr id="706751356" name="Picture 706751356"/>
+            <wp:cNvGraphicFramePr>
+              <a:graphicFrameLocks noChangeAspect="1"/>
+            </wp:cNvGraphicFramePr>
+            <a:graphic>
+              <a:graphicData uri="http://schemas.openxmlformats.org/drawingml/2006/picture">
+                <pic:pic>
+                  <pic:nvPicPr>
+                    <pic:cNvPr id="0" name="live_enforcement_class_model.png"/>
+                    <pic:cNvPicPr/>
+                  </pic:nvPicPr>
+                  <pic:blipFill>
+                    <a:blip r:embed="rId22"/>
+                    <a:stretch>
+                      <a:fillRect/>
+                    </a:stretch>
+                  </pic:blipFill>
+                  <pic:spPr>
+                    <a:xfrm>
+                      <a:off x="0" y="0"/>
+                      <a:ext cx="5943600" cy="5058157"/>
+                    </a:xfrm>
+                    <a:prstGeom prst="rect"/>
+                  </pic:spPr>
+                </pic:pic>
+              </a:graphicData>
+            </a:graphic>
+          </wp:inline>
+        </w:drawing>
+      </w:r>
+    </w:p>
+    <w:p>
+      <w:pPr/>
+      <w:r>
+        <w:rPr>
+          <w:i/>
+          <w:sz w:val="18"/>
+        </w:rPr>
+        <w:t>Figure. Live engineering-rule object model: ChatHealthyEnforcementManager and CommitGovernanceDriver dispatch EnforcementWorker subclasses in parallel; scopes rows on each enforcement entry are the file/pattern excuse mechanism.</w:t>
       </w:r>
     </w:p>
     <w:p>

</xml_diff>